<commit_message>
Actualizando el nombre del proyecto y autores en los informes
</commit_message>
<xml_diff>
--- a/Informe_Proyecto_Integrador_APA.docx
+++ b/Informe_Proyecto_Integrador_APA.docx
@@ -13,7 +13,7 @@
         <w:rPr>
           <w:b/>
         </w:rPr>
-        <w:t>Informe de Proyecto Integrador: Sistema de Registro de Novedades de Becarios</w:t>
+        <w:t>Informe de Proyecto Integrador: Sistema de Registro de Novedades de Becarios FAE</w:t>
       </w:r>
     </w:p>
     <w:p>
@@ -22,11 +22,9 @@
       </w:pPr>
       <w:r>
         <w:br/>
-        <w:t>[Nombre del Estudiante 1]</w:t>
+        <w:t>Bryan Tello</w:t>
         <w:br/>
-        <w:t>[Nombre del Estudiante 2]</w:t>
-        <w:br/>
-        <w:t>[Nombre del Estudiante 3]</w:t>
+        <w:t>Andrés Maldonado</w:t>
       </w:r>
     </w:p>
     <w:p>

</xml_diff>

<commit_message>
Actualizando el Planteamiento del Problema en informe APA
</commit_message>
<xml_diff>
--- a/Informe_Proyecto_Integrador_APA.docx
+++ b/Informe_Proyecto_Integrador_APA.docx
@@ -77,7 +77,7 @@
         <w:ind w:firstLine="720"/>
       </w:pPr>
       <w:r>
-        <w:t>El presente documento detalla el desarrollo del Sistema de Registro de Novedades de Becarios, diseñado como proyecto integrador. La solución abarca las asignaturas de Programación Orientada a Objetos, Base de Datos I y Desarrollo Web Front End (UX/UI). Se ha construido una aplicación web robusta, modular y escalable, aplicando buenas prácticas de ingeniería de software.</w:t>
+        <w:t>El presente documento detalla el desarrollo del Sistema de Registro de Novedades de Becarios FAE, diseñado como proyecto integrador. La solución abarca las asignaturas de Programación Orientada a Objetos, Base de Datos I y Desarrollo Web Front End (UX/UI). Se ha construido una aplicación web robusta, modular y escalable, aplicando buenas prácticas de ingeniería de software.</w:t>
       </w:r>
     </w:p>
     <w:p>
@@ -85,7 +85,39 @@
         <w:pStyle w:val="Heading2"/>
       </w:pPr>
       <w:r>
-        <w:t>Base de Datos I</w:t>
+        <w:t>1. Planteamiento del Problema</w:t>
+      </w:r>
+    </w:p>
+    <w:p>
+      <w:pPr>
+        <w:ind w:firstLine="720"/>
+      </w:pPr>
+      <w:r>
+        <w:t>Actualmente, el registro de asistencias y el seguimiento de novedades diarias de los becarios FAE se lleva a cabo mediante procesos manuales o herramientas ofimáticas descentralizadas. Esto provoca una pérdida significativa de información, falta de trazabilidad en las operaciones críticas, y dificulta la generación rápida de reportes gerenciales para la toma de decisiones. Además, la ausencia de un control de acceso estricto compromete la integridad y seguridad de los datos institucionales.</w:t>
+      </w:r>
+    </w:p>
+    <w:p>
+      <w:pPr>
+        <w:pStyle w:val="Heading2"/>
+      </w:pPr>
+      <w:r>
+        <w:t>2. Solución Tecnológica Propuesta</w:t>
+      </w:r>
+    </w:p>
+    <w:p>
+      <w:pPr>
+        <w:ind w:firstLine="720"/>
+      </w:pPr>
+      <w:r>
+        <w:t>Para solventar las deficiencias identificadas, se ha desarrollado una plataforma web centralizada, escalable y altamente segura. Este sistema automatiza la recopilación de novedades diarias, aplica reglas de negocio para asegurar la integridad de la información, y permite la generación de reportes consolidados en tiempo real. La arquitectura del sistema garantiza la seguridad mediante un modelo de separación de responsabilidades y bases de datos aisladas.</w:t>
+      </w:r>
+    </w:p>
+    <w:p>
+      <w:pPr>
+        <w:pStyle w:val="Heading2"/>
+      </w:pPr>
+      <w:r>
+        <w:t>3. Base de Datos I</w:t>
       </w:r>
     </w:p>
     <w:p>
@@ -137,7 +169,7 @@
         <w:pStyle w:val="Heading2"/>
       </w:pPr>
       <w:r>
-        <w:t>Programación Orientada a Objetos (POO)</w:t>
+        <w:t>4. Programación Orientada a Objetos (POO)</w:t>
       </w:r>
     </w:p>
     <w:p>
@@ -181,7 +213,7 @@
         <w:pStyle w:val="Heading2"/>
       </w:pPr>
       <w:r>
-        <w:t>Desarrollo Web Front End (UX/UI)</w:t>
+        <w:t>5. Desarrollo Web Front End (UX/UI)</w:t>
       </w:r>
     </w:p>
     <w:p>

</xml_diff>